<commit_message>
added the proposal that reflects the code
</commit_message>
<xml_diff>
--- a/RL_Proposal.docx
+++ b/RL_Proposal.docx
@@ -1,6 +1,6 @@
 
 <file path=word/document.xml><?xml version="1.0" encoding="utf-8"?>
-<w:document xmlns:wpc="http://schemas.microsoft.com/office/word/2010/wordprocessingCanvas" xmlns:mc="http://schemas.openxmlformats.org/markup-compatibility/2006" xmlns:o="urn:schemas-microsoft-com:office:office" xmlns:r="http://schemas.openxmlformats.org/officeDocument/2006/relationships" xmlns:m="http://schemas.openxmlformats.org/officeDocument/2006/math" xmlns:v="urn:schemas-microsoft-com:vml" xmlns:wp14="http://schemas.microsoft.com/office/word/2010/wordprocessingDrawing" xmlns:wp="http://schemas.openxmlformats.org/drawingml/2006/wordprocessingDrawing" xmlns:w10="urn:schemas-microsoft-com:office:word" xmlns:w="http://schemas.openxmlformats.org/wordprocessingml/2006/main" xmlns:w14="http://schemas.microsoft.com/office/word/2010/wordml" xmlns:w15="http://schemas.microsoft.com/office/word/2012/wordml" xmlns:wpg="http://schemas.microsoft.com/office/word/2010/wordprocessingGroup" xmlns:wpi="http://schemas.microsoft.com/office/word/2010/wordprocessingInk" xmlns:wne="http://schemas.microsoft.com/office/word/2006/wordml" xmlns:wps="http://schemas.microsoft.com/office/word/2010/wordprocessingShape" xmlns:cx="http://schemas.microsoft.com/office/drawing/2014/chartex" xmlns:cx1="http://schemas.microsoft.com/office/drawing/2015/9/8/chartex" xmlns:cx2="http://schemas.microsoft.com/office/drawing/2015/10/21/chartex" xmlns:cx3="http://schemas.microsoft.com/office/drawing/2016/5/9/chartex" xmlns:cx4="http://schemas.microsoft.com/office/drawing/2016/5/10/chartex" xmlns:cx5="http://schemas.microsoft.com/office/drawing/2016/5/11/chartex" xmlns:cx6="http://schemas.microsoft.com/office/drawing/2016/5/12/chartex" xmlns:cx7="http://schemas.microsoft.com/office/drawing/2016/5/13/chartex" xmlns:cx8="http://schemas.microsoft.com/office/drawing/2016/5/14/chartex" xmlns:aink="http://schemas.microsoft.com/office/drawing/2016/ink" xmlns:am3d="http://schemas.microsoft.com/office/drawing/2017/model3d" xmlns:w16cex="http://schemas.microsoft.com/office/word/2018/wordml/cex" xmlns:w16cid="http://schemas.microsoft.com/office/word/2016/wordml/cid" xmlns:w16="http://schemas.microsoft.com/office/word/2018/wordml" xmlns:w16sdtdh="http://schemas.microsoft.com/office/word/2020/wordml/sdtdatahash" xmlns:w16se="http://schemas.microsoft.com/office/word/2015/wordml/symex" mc:Ignorable="w14 w15 wp14">
+<w:document xmlns:ns1="http://schemas.openxmlformats.org/markup-compatibility/2006" xmlns:w="http://schemas.openxmlformats.org/wordprocessingml/2006/main" ns1:Ignorable="w14 w15 wp14">
   <w:body>
     <w:p>
       <w:pPr>
@@ -60,7 +60,7 @@
           <w:sz w:val="22"/>
           <w:szCs w:val="22"/>
         </w:rPr>
-        <w:t xml:space="preserve">This project studies an autonomous trading agent that learns to buy and sell Apple Inc. (AAPL) stock using daily price data. The agent observes a set of technical indicators derived from OHLCV data and decides each day whether to hold, buy, or enter cash. The goal is to learn a policy that maximizes cumulative portfolio return while limiting drawdown, and to compare how a simple tabular method and a neural-network-based method perform on this task.</w:t>
+        <w:t xml:space="preserve">This project studies an autonomous trading agent that learns to buy and sell Apple Inc. (AAPL) stock using daily price data. The agent observes technical indicators derived from OHLCV data and decides each trading day whether to hold, buy into the stock, or sell into cash. The goal is to learn a policy that maximizes the trading reward and out-of-sample portfolio performance while comparing a simple tabular method with a neural-network-based method.</w:t>
       </w:r>
     </w:p>
     <w:p>
@@ -89,7 +89,7 @@
           <w:sz w:val="22"/>
           <w:szCs w:val="22"/>
         </w:rPr>
-        <w:t xml:space="preserve">The environment is a custom daily trading simulator built from the Reuters AAPL.OQ dataset, which contains 6,841 usable daily bars from October 1998 to December 2025 after removing NaN warm-up rows. The agent must learn when to be invested and when to stay in cash. The main question is whether the agent can learn a trading policy from technical indicators alone that outperforms a passive Buy-and-Hold baseline on out-of-sample data from 2020 to 2025.</w:t>
+        <w:t xml:space="preserve">The environment is a custom daily trading simulator built from the Reuters AAPL.OQ dataset, which contains 6,841 usable daily bars from 16 October 1998 to 26 December 2025 after removing NaN warm-up rows. The agent must learn when to be invested and when to stay in cash. The main question is whether the agent can learn a trading policy from technical indicators alone that performs competitively against a passive Buy-and-Hold baseline on out-of-sample data from July 2020 to December 2025.</w:t>
       </w:r>
     </w:p>
     <w:p>
@@ -133,15 +133,7 @@
           <w:sz w:val="22"/>
           <w:szCs w:val="22"/>
         </w:rPr>
-        <w:t xml:space="preserve">State space S:</w:t>
-      </w:r>
-      <w:r>
-        <w:rPr>
-          <w:rFonts w:ascii="Arial" w:cs="Arial" w:eastAsia="Arial" w:hAnsi="Arial"/>
-          <w:sz w:val="22"/>
-          <w:szCs w:val="22"/>
-        </w:rPr>
-        <w:t xml:space="preserve">: each state is a 7-dimensional vector: RSI/100, normalized MACD, SMA(20)/Close−1, SMA(200)/Close−1, Bollinger %B clipped to [0,1], log-return, and the current position (0 = cash, 1 = invested).</w:t>
+        <w:t xml:space="preserve">State space S: each state is a 7-dimensional vector: RSI/100, MACD/Close clipped to a small range, SMA(20)/Close - 1, SMA(200)/Close - 1, Bollinger %B clipped to [0,1], clipped daily log-return, and the current position (0 = cash, 1 = invested).</w:t>
       </w:r>
     </w:p>
     <w:p>
@@ -179,61 +171,37 @@
           <w:sz w:val="22"/>
           <w:szCs w:val="22"/>
         </w:rPr>
-        <w:t xml:space="preserve">Transition dynamics P(s’|s,a):</w:t>
-      </w:r>
-      <w:r>
-        <w:rPr>
-          <w:rFonts w:ascii="Arial" w:cs="Arial" w:eastAsia="Arial" w:hAnsi="Arial"/>
-          <w:sz w:val="22"/>
-          <w:szCs w:val="22"/>
-        </w:rPr>
-        <w:t xml:space="preserve">: the next state is determined by the next row of the dataset. The episode ends when the final data point is reached. From the agent’s perspective, the market is non-deterministic because future prices are not observable.</w:t>
-      </w:r>
-    </w:p>
-    <w:p>
-      <w:pPr>
-        <w:spacing w:after="160" w:line="276"/>
-      </w:pPr>
-      <w:r>
-        <w:rPr>
-          <w:rFonts w:ascii="Arial" w:cs="Arial" w:eastAsia="Arial" w:hAnsi="Arial"/>
-          <w:b/>
-          <w:bCs/>
-          <w:sz w:val="22"/>
-          <w:szCs w:val="22"/>
-        </w:rPr>
-        <w:t xml:space="preserve">Reward function R(s,a):</w:t>
-      </w:r>
-      <w:r>
-        <w:rPr>
-          <w:rFonts w:ascii="Arial" w:cs="Arial" w:eastAsia="Arial" w:hAnsi="Arial"/>
-          <w:sz w:val="22"/>
-          <w:szCs w:val="22"/>
-        </w:rPr>
-        <w:t xml:space="preserve">: the reward at each step is position × log(Cₜ / Cₜ₋₁) − 0.001 × 𝔙[trade executed]. This gives a positive reward when invested during an up day and penalises each trade by a 0.1 % transaction cost.</w:t>
-      </w:r>
-    </w:p>
-    <w:p>
-      <w:pPr>
-        <w:spacing w:after="160" w:line="276"/>
-      </w:pPr>
-      <w:r>
-        <w:rPr>
-          <w:rFonts w:ascii="Arial" w:cs="Arial" w:eastAsia="Arial" w:hAnsi="Arial"/>
-          <w:b/>
-          <w:bCs/>
-          <w:sz w:val="22"/>
-          <w:szCs w:val="22"/>
-        </w:rPr>
-        <w:t xml:space="preserve">Discount factor γ:</w:t>
-      </w:r>
-      <w:r>
-        <w:rPr>
-          <w:rFonts w:ascii="Arial" w:cs="Arial" w:eastAsia="Arial" w:hAnsi="Arial"/>
-          <w:sz w:val="22"/>
-          <w:szCs w:val="22"/>
-        </w:rPr>
-        <w:t xml:space="preserve">: the main value will be 0.99, with small tests at 0.95 and 0.90.</w:t>
+        <w:t xml:space="preserve">Transition dynamics P(s'|s,a): the next state is determined by the next row of the dataset. The agent observes row t, chooses an action, and receives the forward return from row t+1. This timing avoids look-ahead bias because the reward is based on the next trading day rather than on a return already visible in the current state. The episode ends when the final usable data point is reached.</w:t>
+      </w:r>
+    </w:p>
+    <w:p>
+      <w:pPr>
+        <w:spacing w:after="160" w:line="276"/>
+      </w:pPr>
+      <w:r>
+        <w:rPr>
+          <w:rFonts w:ascii="Arial" w:cs="Arial" w:eastAsia="Arial" w:hAnsi="Arial"/>
+          <w:b/>
+          <w:bCs/>
+          <w:sz w:val="22"/>
+          <w:szCs w:val="22"/>
+        </w:rPr>
+        <w:t xml:space="preserve">Reward function R(s,a): the reward at each step is position_after_action x log(C_{t+1} / C_t) - 0.001 x I[trade executed]. This gives a positive reward when the agent is invested before an up day and penalizes each actual position change by a 0.1% transaction cost.</w:t>
+      </w:r>
+    </w:p>
+    <w:p>
+      <w:pPr>
+        <w:spacing w:after="160" w:line="276"/>
+      </w:pPr>
+      <w:r>
+        <w:rPr>
+          <w:rFonts w:ascii="Arial" w:cs="Arial" w:eastAsia="Arial" w:hAnsi="Arial"/>
+          <w:b/>
+          <w:bCs/>
+          <w:sz w:val="22"/>
+          <w:szCs w:val="22"/>
+        </w:rPr>
+        <w:t xml:space="preserve">Discount factor gamma: the main value is 0.99, with additional Q-Learning ablation tests at 0.95 and 0.90.</w:t>
       </w:r>
     </w:p>
     <w:p>
@@ -262,7 +230,7 @@
           <w:sz w:val="22"/>
           <w:szCs w:val="22"/>
         </w:rPr>
-        <w:t xml:space="preserve">The environment is a custom TradingEnv class with a standard step/reset interface. At each step the agent receives the 7-dimensional state vector, selects an action, and the environment advances by one trading day. The portfolio value is updated as PVₜ₊₁ = PVₜ × exp(rewardₜ). Data is split 80/20 chronologically: October 1998–July 2020 for training (5,472 steps) and July 2020–December 2025 for testing (1,369 steps). The test period includes the COVID crash, the 2022 bear market, and the 2023–2024 AI rally, making it a meaningful out-of-sample evaluation.</w:t>
+        <w:t xml:space="preserve">The environment is a custom TradingEnv class with a standard step/reset interface. At each step the agent receives the 7-dimensional state vector, selects an action, and the environment advances by one trading day. The tracked portfolio value is updated as PV_{t+1} = PV_t x exp(position_after_action x log_return_{t+1}); transaction costs are included in the learning reward but are not deducted from the plotted portfolio value in the current implementation. Data is split chronologically at 1 July 2020: 5,461 rows for training from 16 October 1998 to 30 June 2020, and 1,380 rows for testing from 1 July 2020 to 26 December 2025. The test period includes the COVID crash recovery, the 2022 bear market, and the 2023-2024 AI rally, making it a meaningful out-of-sample evaluation.</w:t>
       </w:r>
     </w:p>
     <w:p>
@@ -291,20 +259,20 @@
           <w:sz w:val="22"/>
           <w:szCs w:val="22"/>
         </w:rPr>
-        <w:t xml:space="preserve">The project will use Q-Learning as the tabular method. Q-Learning is well suited to this problem because the continuous state can be discretized into a small Q-table, and the off-policy update rule allows efficient reuse of experience. The state space will be discretized into B = 4 bins per feature, giving a theoretical space of 4⁶ × 2 = 8,192 states.</w:t>
-      </w:r>
-    </w:p>
-    <w:p>
-      <w:pPr>
-        <w:spacing w:after="160" w:line="276"/>
-      </w:pPr>
-      <w:r>
-        <w:rPr>
-          <w:rFonts w:ascii="Arial" w:cs="Arial" w:eastAsia="Arial" w:hAnsi="Arial"/>
-          <w:sz w:val="22"/>
-          <w:szCs w:val="22"/>
-        </w:rPr>
-        <w:t xml:space="preserve">The advanced method planned for the project is Deep Q-Network (DQN). DQN replaces the Q-table with a two-layer MLP (7 → 64 → 3) and uses a replay buffer and a target network to stabilize training. The network will be implemented from scratch in NumPy without any deep learning framework.</w:t>
+        <w:t xml:space="preserve">The project uses Q-Learning as the tabular method. Q-Learning is well suited to this problem because the continuous state can be discretized into a small Q-table, and the off-policy update rule allows efficient reuse of experience. The six continuous state features are discretized into B = 4 bins by default, while the position feature remains binary, giving a theoretical state space of 4^6 x 2 = 8,192 states.</w:t>
+      </w:r>
+    </w:p>
+    <w:p>
+      <w:pPr>
+        <w:spacing w:after="160" w:line="276"/>
+      </w:pPr>
+      <w:r>
+        <w:rPr>
+          <w:rFonts w:ascii="Arial" w:cs="Arial" w:eastAsia="Arial" w:hAnsi="Arial"/>
+          <w:sz w:val="22"/>
+          <w:szCs w:val="22"/>
+        </w:rPr>
+        <w:t xml:space="preserve">The advanced method implemented for the project is Deep Q-Network (DQN). DQN replaces the Q-table with a two-layer MLP (7 -&gt; 64 -&gt; 3) and uses a replay buffer and a target network to stabilize training. The network, forward pass, backpropagation, and Adam optimizer are implemented from scratch in NumPy without any deep learning framework.</w:t>
       </w:r>
     </w:p>
     <w:p>
@@ -333,20 +301,20 @@
           <w:sz w:val="22"/>
           <w:szCs w:val="22"/>
         </w:rPr>
-        <w:t xml:space="preserve">For Q-Learning, an epsilon-greedy strategy will be used. Epsilon will start at 1.0 and decay by a factor of 0.9995 per step down to a minimum of 0.01. The learning rate will be set to 0.1. Training will run for 40 episodes (40 full passes through the training data).</w:t>
-      </w:r>
-    </w:p>
-    <w:p>
-      <w:pPr>
-        <w:spacing w:after="160" w:line="276"/>
-      </w:pPr>
-      <w:r>
-        <w:rPr>
-          <w:rFonts w:ascii="Arial" w:cs="Arial" w:eastAsia="Arial" w:hAnsi="Arial"/>
-          <w:sz w:val="22"/>
-          <w:szCs w:val="22"/>
-        </w:rPr>
-        <w:t xml:space="preserve">For DQN, training will include the same epsilon-greedy schedule with a slower decay of 0.9997 per step. The replay buffer will hold the last 3,000 transitions and mini-batches of 64 will be sampled at every step. The target network will be updated every 200 steps by a hard copy.</w:t>
+        <w:t xml:space="preserve">For Q-Learning, an epsilon-greedy strategy is used. Epsilon starts at 1.0 and decays by a factor of 0.9995 per update down to a minimum of 0.01. The learning rate is set to 0.1. Training runs for 40 episodes, meaning 40 full passes through the training data.</w:t>
+      </w:r>
+    </w:p>
+    <w:p>
+      <w:pPr>
+        <w:spacing w:after="160" w:line="276"/>
+      </w:pPr>
+      <w:r>
+        <w:rPr>
+          <w:rFonts w:ascii="Arial" w:cs="Arial" w:eastAsia="Arial" w:hAnsi="Arial"/>
+          <w:sz w:val="22"/>
+          <w:szCs w:val="22"/>
+        </w:rPr>
+        <w:t xml:space="preserve">For DQN, training uses epsilon-greedy exploration with a slower decay of 0.9997 per update. The replay buffer holds the last 3,000 transitions, mini-batches of 64 are sampled during training, and the target network is updated every 200 training steps by a hard copy.</w:t>
       </w:r>
     </w:p>
     <w:p>
@@ -472,7 +440,7 @@
           <w:sz w:val="22"/>
           <w:szCs w:val="22"/>
         </w:rPr>
-        <w:t xml:space="preserve">Q-Learning is expected to learn a profitable strategy on the test set because its coarse discretization provides implicit regularisation and the RSI and MACD features capture AAPL’s strong momentum characteristics. DQN is expected to be harder to train given the limited sample size and financial non-stationarity, but its continuous state representation could be advantageous if training is extended. A Buy-and-Hold baseline is expected to serve as a difficult benchmark given the strong bull trend in the 2020–2025 test period.</w:t>
+        <w:t xml:space="preserve">The saved run shows that both reinforcement-learning agents can produce positive out-of-sample returns, but Buy-and-Hold remains the strongest benchmark during the 2020-2025 AAPL test period. In the current results, Q-Learning returns about 21.4%, DQN returns about 78.3%, and Buy-and-Hold returns about 200.3%. This supports the interpretation that the RL agents learn meaningful trading behavior, while the strong bull trend in AAPL makes passive exposure difficult to beat.</w:t>
       </w:r>
     </w:p>
     <w:p>
@@ -501,7 +469,7 @@
           <w:sz w:val="22"/>
           <w:szCs w:val="22"/>
         </w:rPr>
-        <w:t xml:space="preserve">To make the project reproducible, numpy.random.seed(42) will be fixed at the start of every script, all required libraries will be listed with version numbers, and the code will be organised so that the experiments can be re-run from a single command with the same settings.</w:t>
+        <w:t xml:space="preserve">To make the project reproducible, numpy.random.seed(42) is fixed in the training scripts, required libraries are listed in requirements.txt, and the full experiment pipeline can be re-run from a single command with python run_all.py. This command trains both agents, runs the Q-Learning ablations, and regenerates all figures under results/figures/.</w:t>
       </w:r>
     </w:p>
     <w:p>
@@ -530,7 +498,7 @@
           <w:sz w:val="22"/>
           <w:szCs w:val="22"/>
         </w:rPr>
-        <w:t xml:space="preserve">The final submission will include the source code, the technical report (8–12 pages), and the experimental plots and tables.</w:t>
+        <w:t xml:space="preserve">The final submission includes the source code, the proposal/report materials, saved experiment outputs, and experimental plots and tables generated from the results directory.</w:t>
       </w:r>
     </w:p>
     <w:p>
@@ -559,7 +527,7 @@
           <w:sz w:val="22"/>
           <w:szCs w:val="22"/>
         </w:rPr>
-        <w:t xml:space="preserve">This project is a focused reinforcement learning study on autonomous stock trading using real financial data. It satisfies the course requirements by defining a clear RL problem, formulating it as an MDP, implementing a tabular method and a deep method from scratch, comparing them through controlled experiments, evaluating them with standard financial and RL metrics, and making the work fully reproducible.</w:t>
+        <w:t xml:space="preserve">This project is a focused reinforcement learning study on autonomous stock trading using real financial data. It satisfies the course requirements by defining a clear RL problem, formulating it as an MDP, implementing a tabular method and a deep method from scratch, comparing them through controlled experiments, evaluating them with standard financial and RL metrics, and providing a reproducible single-command workflow for rerunning the work.</w:t>
       </w:r>
     </w:p>
     <w:sectPr>

</xml_diff>